<commit_message>
Actualizacion Hoja de vida
</commit_message>
<xml_diff>
--- a/2. HOJA DE VIDA INSTITUCIONAL MICHAEL BLANCO.docx
+++ b/2. HOJA DE VIDA INSTITUCIONAL MICHAEL BLANCO.docx
@@ -336,8 +336,62 @@
             <w:bCs/>
             <w:lang w:val="es-ES"/>
           </w:rPr>
-          <w:t>Michael Bl</w:t>
+          <w:t>Michael Blanco</w:t>
         </w:r>
+      </w:hyperlink>
+    </w:p>
+    <w:p>
+      <w:pPr>
+        <w:rPr>
+          <w:rFonts w:asciiTheme="minorHAnsi" w:eastAsiaTheme="minorEastAsia" w:hAnsiTheme="minorHAnsi" w:cstheme="minorBidi"/>
+          <w:b/>
+          <w:bCs/>
+          <w:color w:val="000000" w:themeColor="text1"/>
+          <w:lang w:val="es-ES"/>
+        </w:rPr>
+      </w:pPr>
+      <w:r>
+        <w:rPr>
+          <w:rFonts w:asciiTheme="minorHAnsi" w:eastAsiaTheme="minorEastAsia" w:hAnsiTheme="minorHAnsi" w:cstheme="minorBidi"/>
+          <w:b/>
+          <w:bCs/>
+          <w:color w:val="000000" w:themeColor="text1"/>
+          <w:lang w:val="es-ES"/>
+        </w:rPr>
+        <w:t>Perfil profesional</w:t>
+      </w:r>
+      <w:r>
+        <w:rPr>
+          <w:rFonts w:asciiTheme="minorHAnsi" w:eastAsiaTheme="minorEastAsia" w:hAnsiTheme="minorHAnsi" w:cstheme="minorBidi"/>
+          <w:b/>
+          <w:bCs/>
+          <w:color w:val="000000" w:themeColor="text1"/>
+          <w:lang w:val="es-ES"/>
+        </w:rPr>
+        <w:t>: Ingeniero Multimedia</w:t>
+      </w:r>
+    </w:p>
+    <w:p>
+      <w:pPr>
+        <w:rPr>
+          <w:rFonts w:asciiTheme="minorHAnsi" w:eastAsiaTheme="minorEastAsia" w:hAnsiTheme="minorHAnsi" w:cstheme="minorBidi"/>
+          <w:b/>
+          <w:bCs/>
+          <w:color w:val="000000" w:themeColor="text1"/>
+          <w:lang w:val="es-ES"/>
+        </w:rPr>
+      </w:pPr>
+      <w:r>
+        <w:rPr>
+          <w:rFonts w:asciiTheme="minorHAnsi" w:eastAsiaTheme="minorEastAsia" w:hAnsiTheme="minorHAnsi" w:cstheme="minorBidi"/>
+          <w:b/>
+          <w:bCs/>
+          <w:color w:val="000000" w:themeColor="text1"/>
+          <w:lang w:val="es-ES"/>
+        </w:rPr>
+        <w:t xml:space="preserve">Portafolio: </w:t>
+      </w:r>
+      <w:hyperlink r:id="rId10" w:history="1">
         <w:r>
           <w:rPr>
             <w:rStyle w:val="Hipervnculo"/>
@@ -346,32 +400,10 @@
             <w:bCs/>
             <w:lang w:val="es-ES"/>
           </w:rPr>
-          <w:t>a</w:t>
-        </w:r>
-        <w:r>
-          <w:rPr>
-            <w:rStyle w:val="Hipervnculo"/>
-            <w:rFonts w:asciiTheme="minorHAnsi" w:eastAsiaTheme="minorEastAsia" w:hAnsiTheme="minorHAnsi" w:cstheme="minorBidi"/>
-            <w:b/>
-            <w:bCs/>
-            <w:lang w:val="es-ES"/>
-          </w:rPr>
-          <w:t>n</w:t>
-        </w:r>
-        <w:r>
-          <w:rPr>
-            <w:rStyle w:val="Hipervnculo"/>
-            <w:rFonts w:asciiTheme="minorHAnsi" w:eastAsiaTheme="minorEastAsia" w:hAnsiTheme="minorHAnsi" w:cstheme="minorBidi"/>
-            <w:b/>
-            <w:bCs/>
-            <w:lang w:val="es-ES"/>
-          </w:rPr>
-          <w:t>co</w:t>
+          <w:t>https://mike1902-maker.github.io</w:t>
         </w:r>
       </w:hyperlink>
-    </w:p>
-    <w:p>
-      <w:pPr>
+      <w:r>
         <w:rPr>
           <w:rFonts w:asciiTheme="minorHAnsi" w:eastAsiaTheme="minorEastAsia" w:hAnsiTheme="minorHAnsi" w:cstheme="minorBidi"/>
           <w:b/>
@@ -379,26 +411,7 @@
           <w:color w:val="000000" w:themeColor="text1"/>
           <w:lang w:val="es-ES"/>
         </w:rPr>
-      </w:pPr>
-      <w:r>
-        <w:rPr>
-          <w:rFonts w:asciiTheme="minorHAnsi" w:eastAsiaTheme="minorEastAsia" w:hAnsiTheme="minorHAnsi" w:cstheme="minorBidi"/>
-          <w:b/>
-          <w:bCs/>
-          <w:color w:val="000000" w:themeColor="text1"/>
-          <w:lang w:val="es-ES"/>
-        </w:rPr>
-        <w:t>Perfil profesional</w:t>
-      </w:r>
-      <w:r>
-        <w:rPr>
-          <w:rFonts w:asciiTheme="minorHAnsi" w:eastAsiaTheme="minorEastAsia" w:hAnsiTheme="minorHAnsi" w:cstheme="minorBidi"/>
-          <w:b/>
-          <w:bCs/>
-          <w:color w:val="000000" w:themeColor="text1"/>
-          <w:lang w:val="es-ES"/>
-        </w:rPr>
-        <w:t>: Ingeniero Multimedia</w:t>
+        <w:t xml:space="preserve"> </w:t>
       </w:r>
     </w:p>
     <w:p>
@@ -437,16 +450,6 @@
     </w:p>
     <w:p>
       <w:pPr>
-        <w:rPr>
-          <w:rFonts w:asciiTheme="minorHAnsi" w:hAnsiTheme="minorHAnsi" w:cstheme="minorBidi"/>
-          <w:sz w:val="22"/>
-          <w:szCs w:val="22"/>
-        </w:rPr>
-      </w:pPr>
-    </w:p>
-    <w:p>
-      <w:pPr>
-        <w:pStyle w:val="Prrafodelista"/>
         <w:shd w:val="clear" w:color="auto" w:fill="FFFFFF" w:themeFill="background1"/>
         <w:spacing w:before="240" w:after="240"/>
         <w:rPr>
@@ -6077,7 +6080,7 @@
                     </pic:cNvPicPr>
                   </pic:nvPicPr>
                   <pic:blipFill rotWithShape="1">
-                    <a:blip r:embed="rId10" cstate="print">
+                    <a:blip r:embed="rId11" cstate="print">
                       <a:extLst>
                         <a:ext uri="{28A0092B-C50C-407E-A947-70E740481C1C}">
                           <a14:useLocalDpi xmlns:a14="http://schemas.microsoft.com/office/drawing/2010/main" val="0"/>
@@ -6289,8 +6292,8 @@
     </w:p>
     <w:p/>
     <w:sectPr>
-      <w:headerReference w:type="default" r:id="rId11"/>
-      <w:footerReference w:type="default" r:id="rId12"/>
+      <w:headerReference w:type="default" r:id="rId12"/>
+      <w:footerReference w:type="default" r:id="rId13"/>
       <w:pgSz w:w="12240" w:h="15840"/>
       <w:pgMar w:top="1418" w:right="1701" w:bottom="1418" w:left="1701" w:header="709" w:footer="709" w:gutter="0"/>
       <w:pgNumType w:start="1"/>

</xml_diff>